<commit_message>
Add Lecture Week 1 Note
</commit_message>
<xml_diff>
--- a/Modules/Week1/Lecture1 Note.docx
+++ b/Modules/Week1/Lecture1 Note.docx
@@ -422,6 +422,7 @@
     <w:p>
       <w:pPr>
         <w:numPr>
+          <w:ilvl w:val="0"/>
           <w:numId w:val="0"/>
         </w:numPr>
         <w:jc w:val="both"/>
@@ -469,6 +470,7 @@
     <w:p>
       <w:pPr>
         <w:numPr>
+          <w:ilvl w:val="0"/>
           <w:numId w:val="0"/>
         </w:numPr>
         <w:jc w:val="both"/>
@@ -511,6 +513,7 @@
     <w:p>
       <w:pPr>
         <w:numPr>
+          <w:ilvl w:val="0"/>
           <w:numId w:val="0"/>
         </w:numPr>
         <w:rPr>
@@ -537,6 +540,7 @@
     <w:p>
       <w:pPr>
         <w:numPr>
+          <w:ilvl w:val="0"/>
           <w:numId w:val="0"/>
         </w:numPr>
         <w:rPr>
@@ -563,6 +567,7 @@
     <w:p>
       <w:pPr>
         <w:numPr>
+          <w:ilvl w:val="0"/>
           <w:numId w:val="0"/>
         </w:numPr>
         <w:jc w:val="both"/>
@@ -590,6 +595,7 @@
     <w:p>
       <w:pPr>
         <w:numPr>
+          <w:ilvl w:val="0"/>
           <w:numId w:val="0"/>
         </w:numPr>
         <w:jc w:val="both"/>
@@ -633,6 +639,7 @@
     <w:p>
       <w:pPr>
         <w:numPr>
+          <w:ilvl w:val="0"/>
           <w:numId w:val="0"/>
         </w:numPr>
         <w:rPr>
@@ -659,6 +666,7 @@
     <w:p>
       <w:pPr>
         <w:numPr>
+          <w:ilvl w:val="0"/>
           <w:numId w:val="0"/>
         </w:numPr>
         <w:rPr>
@@ -685,6 +693,7 @@
     <w:p>
       <w:pPr>
         <w:numPr>
+          <w:ilvl w:val="0"/>
           <w:numId w:val="0"/>
         </w:numPr>
         <w:jc w:val="both"/>
@@ -728,6 +737,7 @@
     <w:p>
       <w:pPr>
         <w:numPr>
+          <w:ilvl w:val="0"/>
           <w:numId w:val="0"/>
         </w:numPr>
         <w:rPr>
@@ -754,6 +764,7 @@
     <w:p>
       <w:pPr>
         <w:numPr>
+          <w:ilvl w:val="0"/>
           <w:numId w:val="0"/>
         </w:numPr>
         <w:rPr>
@@ -780,6 +791,7 @@
     <w:p>
       <w:pPr>
         <w:numPr>
+          <w:ilvl w:val="0"/>
           <w:numId w:val="0"/>
         </w:numPr>
         <w:rPr>
@@ -806,6 +818,7 @@
     <w:p>
       <w:pPr>
         <w:numPr>
+          <w:ilvl w:val="0"/>
           <w:numId w:val="0"/>
         </w:numPr>
         <w:rPr>
@@ -848,6 +861,7 @@
     <w:p>
       <w:pPr>
         <w:numPr>
+          <w:ilvl w:val="0"/>
           <w:numId w:val="0"/>
         </w:numPr>
         <w:rPr>
@@ -943,34 +957,7 @@
     <w:p>
       <w:pPr>
         <w:numPr>
-          <w:numId w:val="0"/>
-        </w:numPr>
-        <w:rPr>
-          <w:rFonts w:hint="default" w:ascii="SimSun" w:hAnsi="SimSun" w:eastAsia="SimSun" w:cs="SimSun"/>
-          <w:sz w:val="24"/>
-          <w:szCs w:val="24"/>
-          <w:lang w:val="en-US"/>
-        </w:rPr>
-      </w:pPr>
-    </w:p>
-    <w:p>
-      <w:pPr>
-        <w:numPr>
-          <w:numId w:val="0"/>
-        </w:numPr>
-        <w:rPr>
-          <w:rFonts w:hint="default" w:ascii="Times New Roman" w:hAnsi="Times New Roman" w:eastAsia="SimSun" w:cs="Times New Roman"/>
-          <w:b w:val="0"/>
-          <w:bCs w:val="0"/>
-          <w:sz w:val="24"/>
-          <w:szCs w:val="24"/>
-          <w:lang w:val="en-US"/>
-        </w:rPr>
-      </w:pPr>
-    </w:p>
-    <w:p>
-      <w:pPr>
-        <w:numPr>
+          <w:ilvl w:val="0"/>
           <w:numId w:val="0"/>
         </w:numPr>
         <w:jc w:val="both"/>
@@ -1239,7 +1226,7 @@
     <w:lsdException w:unhideWhenUsed="0" w:uiPriority="0" w:semiHidden="0" w:name="Document Map"/>
     <w:lsdException w:unhideWhenUsed="0" w:uiPriority="0" w:semiHidden="0" w:name="Plain Text"/>
     <w:lsdException w:unhideWhenUsed="0" w:uiPriority="0" w:semiHidden="0" w:name="E-mail Signature"/>
-    <w:lsdException w:unhideWhenUsed="0" w:uiPriority="0" w:semiHidden="0" w:name="Normal (Web)"/>
+    <w:lsdException w:qFormat="1" w:unhideWhenUsed="0" w:uiPriority="0" w:semiHidden="0" w:name="Normal (Web)"/>
     <w:lsdException w:unhideWhenUsed="0" w:uiPriority="0" w:semiHidden="0" w:name="HTML Acronym"/>
     <w:lsdException w:unhideWhenUsed="0" w:uiPriority="0" w:semiHidden="0" w:name="HTML Address"/>
     <w:lsdException w:unhideWhenUsed="0" w:uiPriority="0" w:semiHidden="0" w:name="HTML Cite"/>
@@ -1427,6 +1414,7 @@
   </w:style>
   <w:style w:type="paragraph" w:styleId="4">
     <w:name w:val="Normal (Web)"/>
+    <w:qFormat/>
     <w:uiPriority w:val="0"/>
     <w:pPr>
       <w:spacing w:before="0" w:beforeAutospacing="1" w:after="0" w:afterAutospacing="1"/>
@@ -1434,6 +1422,7 @@
       <w:jc w:val="left"/>
     </w:pPr>
     <w:rPr>
+      <w:rFonts w:ascii="Times New Roman" w:hAnsi="Times New Roman" w:eastAsia="SimSun" w:cs="Times New Roman"/>
       <w:kern w:val="0"/>
       <w:sz w:val="24"/>
       <w:szCs w:val="24"/>

</xml_diff>